<commit_message>
Migrating order service open feign (inventory) to restclient
</commit_message>
<xml_diff>
--- a/Documentación.docx
+++ b/Documentación.docx
@@ -1579,37 +1579,22 @@
         <w:br/>
       </w:r>
       <w:r>
-        <w:rPr>
-          <w:rFonts w:ascii="Arial" w:hAnsi="Arial" w:cs="Arial"/>
-        </w:rPr>
         <w:t xml:space="preserve">Spring Cloud </w:t>
       </w:r>
       <w:proofErr w:type="spellStart"/>
       <w:r>
-        <w:rPr>
-          <w:rFonts w:ascii="Arial" w:hAnsi="Arial" w:cs="Arial"/>
-        </w:rPr>
         <w:t>OpenFeign</w:t>
       </w:r>
       <w:proofErr w:type="spellEnd"/>
       <w:r>
-        <w:rPr>
-          <w:rFonts w:ascii="Arial" w:hAnsi="Arial" w:cs="Arial"/>
-        </w:rPr>
         <w:t xml:space="preserve"> is a declarative HTTP client that makes it easy to call other </w:t>
       </w:r>
       <w:proofErr w:type="spellStart"/>
       <w:r>
-        <w:rPr>
-          <w:rFonts w:ascii="Arial" w:hAnsi="Arial" w:cs="Arial"/>
-        </w:rPr>
         <w:t>microservices</w:t>
       </w:r>
       <w:proofErr w:type="spellEnd"/>
       <w:r>
-        <w:rPr>
-          <w:rFonts w:ascii="Arial" w:hAnsi="Arial" w:cs="Arial"/>
-        </w:rPr>
         <w:t xml:space="preserve"> in a Spring Boot application.</w:t>
       </w:r>
     </w:p>
@@ -1740,22 +1725,22 @@
           <w:sz w:val="24"/>
           <w:u w:val="single"/>
         </w:rPr>
+        <w:t>Add the dependency:</w:t>
+      </w:r>
+    </w:p>
+    <w:p>
+      <w:pPr>
+        <w:rPr>
+          <w:rFonts w:ascii="Arial" w:hAnsi="Arial" w:cs="Arial"/>
+          <w:sz w:val="24"/>
+        </w:rPr>
+      </w:pPr>
+      <w:r>
+        <w:rPr>
+          <w:rFonts w:ascii="Arial" w:hAnsi="Arial" w:cs="Arial"/>
+          <w:sz w:val="24"/>
+        </w:rPr>
         <w:lastRenderedPageBreak/>
-        <w:t>Add the dependency:</w:t>
-      </w:r>
-    </w:p>
-    <w:p>
-      <w:pPr>
-        <w:rPr>
-          <w:rFonts w:ascii="Arial" w:hAnsi="Arial" w:cs="Arial"/>
-          <w:sz w:val="24"/>
-        </w:rPr>
-      </w:pPr>
-      <w:r>
-        <w:rPr>
-          <w:rFonts w:ascii="Arial" w:hAnsi="Arial" w:cs="Arial"/>
-          <w:sz w:val="24"/>
-        </w:rPr>
         <w:t>spring-cloud-starter-</w:t>
       </w:r>
       <w:proofErr w:type="spellStart"/>
@@ -2001,6 +1986,16 @@
           <w:sz w:val="24"/>
         </w:rPr>
       </w:pPr>
+      <w:r>
+        <w:rPr>
+          <w:rFonts w:ascii="Arial" w:hAnsi="Arial" w:cs="Arial"/>
+          <w:sz w:val="24"/>
+        </w:rPr>
+        <w:br/>
+        <w:t>We will use a more modern approach, which is rest client</w:t>
+      </w:r>
+      <w:bookmarkStart w:id="0" w:name="_GoBack"/>
+      <w:bookmarkEnd w:id="0"/>
     </w:p>
     <w:p>
       <w:pPr>
@@ -4261,8 +4256,6 @@
         <w:br/>
         <w:t>Press on use token and the token gets added to the header.</w:t>
       </w:r>
-      <w:bookmarkStart w:id="0" w:name="_GoBack"/>
-      <w:bookmarkEnd w:id="0"/>
     </w:p>
     <w:sectPr>
       <w:pgSz w:w="11906" w:h="16838"/>
@@ -5429,7 +5422,6 @@
   <w:style w:type="character" w:default="1" w:styleId="Fuentedeprrafopredeter">
     <w:name w:val="Default Paragraph Font"/>
     <w:uiPriority w:val="1"/>
-    <w:semiHidden/>
     <w:unhideWhenUsed/>
   </w:style>
   <w:style w:type="table" w:default="1" w:styleId="Tablanormal">

</xml_diff>

<commit_message>
Angular & Cors API Gateway
</commit_message>
<xml_diff>
--- a/Documentación.docx
+++ b/Documentación.docx
@@ -4188,10 +4188,7 @@
       <w:pPr>
         <w:spacing w:before="100" w:beforeAutospacing="1" w:after="100" w:afterAutospacing="1" w:line="240" w:lineRule="auto"/>
         <w:rPr>
-          <w:rFonts w:eastAsia="Times New Roman" w:cstheme="minorHAnsi"/>
-          <w:sz w:val="24"/>
-          <w:szCs w:val="24"/>
-          <w:lang w:eastAsia="en-GB"/>
+          <w:sz w:val="24"/>
         </w:rPr>
       </w:pPr>
       <w:r>
@@ -4284,60 +4281,56 @@
         </w:rPr>
         <w:br/>
       </w:r>
-    </w:p>
-    <w:p>
-      <w:pPr>
-        <w:rPr>
-          <w:rStyle w:val="Ttulo1Car"/>
-          <w:rFonts w:asciiTheme="minorHAnsi" w:hAnsiTheme="minorHAnsi" w:cstheme="minorHAnsi"/>
-        </w:rPr>
-      </w:pPr>
-      <w:r>
-        <w:rPr>
-          <w:rStyle w:val="Ttulo1Car"/>
-          <w:rFonts w:asciiTheme="minorHAnsi" w:hAnsiTheme="minorHAnsi" w:cstheme="minorHAnsi"/>
-        </w:rPr>
-        <w:t xml:space="preserve">7 </w:t>
-      </w:r>
-      <w:r>
-        <w:rPr>
-          <w:rStyle w:val="Ttulo1Car"/>
-          <w:rFonts w:asciiTheme="minorHAnsi" w:hAnsiTheme="minorHAnsi" w:cstheme="minorHAnsi"/>
-        </w:rPr>
-        <w:t>-</w:t>
-      </w:r>
-      <w:r>
-        <w:rPr>
-          <w:rStyle w:val="Ttulo1Car"/>
-          <w:rFonts w:asciiTheme="minorHAnsi" w:hAnsiTheme="minorHAnsi" w:cstheme="minorHAnsi"/>
-        </w:rPr>
-        <w:t xml:space="preserve"> Circuit breaker</w:t>
-      </w:r>
-      <w:r>
-        <w:rPr>
-          <w:rStyle w:val="Ttulo1Car"/>
-          <w:rFonts w:asciiTheme="minorHAnsi" w:hAnsiTheme="minorHAnsi" w:cstheme="minorHAnsi"/>
-        </w:rPr>
-        <w:br/>
-      </w:r>
-    </w:p>
-    <w:p>
-      <w:pPr>
-        <w:rPr>
-          <w:rFonts w:cstheme="minorHAnsi"/>
-          <w:sz w:val="24"/>
-        </w:rPr>
-      </w:pPr>
-      <w:r>
-        <w:rPr>
-          <w:rStyle w:val="Ttulo1Car"/>
-          <w:rFonts w:asciiTheme="minorHAnsi" w:hAnsiTheme="minorHAnsi" w:cstheme="minorHAnsi"/>
+      <w:r>
+        <w:rPr>
+          <w:sz w:val="24"/>
+        </w:rPr>
+        <w:t xml:space="preserve">To authenticate the Angular frontend client application, we need to create a new client in our </w:t>
+      </w:r>
+      <w:proofErr w:type="spellStart"/>
+      <w:r>
+        <w:rPr>
+          <w:sz w:val="24"/>
+        </w:rPr>
+        <w:t>Keycloak</w:t>
+      </w:r>
+      <w:proofErr w:type="spellEnd"/>
+      <w:r>
+        <w:rPr>
+          <w:sz w:val="24"/>
+        </w:rPr>
+        <w:t xml:space="preserve"> realm</w:t>
+      </w:r>
+      <w:r>
+        <w:rPr>
+          <w:sz w:val="24"/>
+        </w:rPr>
+        <w:t>.</w:t>
+      </w:r>
+      <w:r>
+        <w:rPr>
+          <w:sz w:val="24"/>
+        </w:rPr>
+        <w:br/>
+      </w:r>
+      <w:r>
+        <w:rPr>
+          <w:sz w:val="24"/>
+        </w:rPr>
+        <w:br/>
+      </w:r>
+      <w:r>
+        <w:rPr>
+          <w:rFonts w:eastAsia="Times New Roman" w:cstheme="minorHAnsi"/>
+          <w:sz w:val="24"/>
+          <w:szCs w:val="24"/>
+          <w:lang w:eastAsia="en-GB"/>
         </w:rPr>
         <w:drawing>
-          <wp:inline distT="0" distB="0" distL="0" distR="0" wp14:anchorId="0DE0EC73" wp14:editId="4503E34D">
-            <wp:extent cx="5400040" cy="2410460"/>
-            <wp:effectExtent l="0" t="0" r="0" b="8890"/>
-            <wp:docPr id="25" name="Imagen 25"/>
+          <wp:inline distT="0" distB="0" distL="0" distR="0" wp14:anchorId="6FF61FCB" wp14:editId="410ED81A">
+            <wp:extent cx="5400040" cy="3133090"/>
+            <wp:effectExtent l="0" t="0" r="0" b="0"/>
+            <wp:docPr id="31" name="Imagen 31"/>
             <wp:cNvGraphicFramePr>
               <a:graphicFrameLocks xmlns:a="http://schemas.openxmlformats.org/drawingml/2006/main" noChangeAspect="1"/>
             </wp:cNvGraphicFramePr>
@@ -4357,7 +4350,7 @@
                   <pic:spPr>
                     <a:xfrm>
                       <a:off x="0" y="0"/>
-                      <a:ext cx="5400040" cy="2410460"/>
+                      <a:ext cx="5400040" cy="3133090"/>
                     </a:xfrm>
                     <a:prstGeom prst="rect">
                       <a:avLst/>
@@ -4369,200 +4362,28 @@
           </wp:inline>
         </w:drawing>
       </w:r>
-    </w:p>
-    <w:p>
-      <w:pPr>
-        <w:pStyle w:val="NormalWeb"/>
-      </w:pPr>
-      <w:r>
-        <w:rPr>
-          <w:rStyle w:val="Ttulo1Car"/>
-          <w:rFonts w:asciiTheme="minorHAnsi" w:hAnsiTheme="minorHAnsi" w:cstheme="minorHAnsi"/>
-        </w:rPr>
-        <w:br/>
-      </w:r>
-      <w:r>
-        <w:rPr>
-          <w:rFonts w:asciiTheme="minorHAnsi" w:hAnsiTheme="minorHAnsi" w:cstheme="minorHAnsi"/>
-        </w:rPr>
-        <w:t xml:space="preserve">A </w:t>
-      </w:r>
-      <w:r>
-        <w:rPr>
-          <w:rStyle w:val="Textoennegrita"/>
-          <w:rFonts w:asciiTheme="minorHAnsi" w:hAnsiTheme="minorHAnsi" w:cstheme="minorHAnsi"/>
-        </w:rPr>
-        <w:t>circuit breaker</w:t>
-      </w:r>
-      <w:r>
-        <w:rPr>
-          <w:rFonts w:asciiTheme="minorHAnsi" w:hAnsiTheme="minorHAnsi" w:cstheme="minorHAnsi"/>
-        </w:rPr>
-        <w:t xml:space="preserve"> is a design pattern used in </w:t>
-      </w:r>
-      <w:proofErr w:type="spellStart"/>
-      <w:r>
-        <w:rPr>
-          <w:rFonts w:asciiTheme="minorHAnsi" w:hAnsiTheme="minorHAnsi" w:cstheme="minorHAnsi"/>
-        </w:rPr>
-        <w:t>microservices</w:t>
-      </w:r>
-      <w:proofErr w:type="spellEnd"/>
-      <w:r>
-        <w:rPr>
-          <w:rFonts w:asciiTheme="minorHAnsi" w:hAnsiTheme="minorHAnsi" w:cstheme="minorHAnsi"/>
-        </w:rPr>
-        <w:t xml:space="preserve"> and distributed systems to improve reliability. It acts like a safety switch that stops requests to a failing service after a certain number of errors, preventing system overload and long wait times. After a </w:t>
-      </w:r>
-      <w:proofErr w:type="spellStart"/>
-      <w:r>
-        <w:rPr>
-          <w:rFonts w:asciiTheme="minorHAnsi" w:hAnsiTheme="minorHAnsi" w:cstheme="minorHAnsi"/>
-        </w:rPr>
-        <w:t>cooldown</w:t>
-      </w:r>
-      <w:proofErr w:type="spellEnd"/>
-      <w:r>
-        <w:rPr>
-          <w:rFonts w:asciiTheme="minorHAnsi" w:hAnsiTheme="minorHAnsi" w:cstheme="minorHAnsi"/>
-        </w:rPr>
-        <w:t xml:space="preserve"> period, it tests the service again to see if it has recovered, allowing requests to resume. This helps maintain overall system stability and resilience.</w:t>
-      </w:r>
-      <w:r>
-        <w:rPr>
-          <w:rFonts w:cstheme="minorHAnsi"/>
-        </w:rPr>
-        <w:br/>
-      </w:r>
-      <w:r>
-        <w:rPr>
-          <w:rFonts w:cstheme="minorHAnsi"/>
-        </w:rPr>
-        <w:br/>
-      </w:r>
-      <w:r>
-        <w:rPr>
-          <w:rStyle w:val="Textoennegrita"/>
-        </w:rPr>
-        <w:t>Resilience4j</w:t>
-      </w:r>
-      <w:r>
-        <w:t xml:space="preserve"> is a lightweight, easy-to-use fault tolerance library for Java applications. It helps developers build resilient systems by providing common patterns like </w:t>
-      </w:r>
-      <w:r>
-        <w:rPr>
-          <w:rStyle w:val="Textoennegrita"/>
-        </w:rPr>
-        <w:t xml:space="preserve">circuit </w:t>
-      </w:r>
-      <w:r>
-        <w:rPr>
-          <w:rStyle w:val="Textoennegrita"/>
+      <w:r>
+        <w:rPr>
+          <w:rFonts w:eastAsia="Times New Roman" w:cstheme="minorHAnsi"/>
+          <w:sz w:val="24"/>
+          <w:szCs w:val="24"/>
+          <w:lang w:eastAsia="en-GB"/>
+        </w:rPr>
+        <w:br/>
+      </w:r>
+      <w:r>
+        <w:rPr>
+          <w:rFonts w:eastAsia="Times New Roman" w:cstheme="minorHAnsi"/>
+          <w:sz w:val="24"/>
+          <w:szCs w:val="24"/>
+          <w:lang w:eastAsia="en-GB"/>
         </w:rPr>
         <w:lastRenderedPageBreak/>
-        <w:t>breakers</w:t>
-      </w:r>
-      <w:r>
-        <w:t xml:space="preserve">, </w:t>
-      </w:r>
-      <w:r>
-        <w:rPr>
-          <w:rStyle w:val="Textoennegrita"/>
-        </w:rPr>
-        <w:t>rate limiters</w:t>
-      </w:r>
-      <w:r>
-        <w:t xml:space="preserve">, </w:t>
-      </w:r>
-      <w:r>
-        <w:rPr>
-          <w:rStyle w:val="Textoennegrita"/>
-        </w:rPr>
-        <w:t>retry mechanisms</w:t>
-      </w:r>
-      <w:r>
-        <w:t xml:space="preserve">, and </w:t>
-      </w:r>
-      <w:r>
-        <w:rPr>
-          <w:rStyle w:val="Textoennegrita"/>
-        </w:rPr>
-        <w:t>bulkheads</w:t>
-      </w:r>
-      <w:r>
-        <w:t xml:space="preserve">. Resilience4j is designed to work well with modern Java frameworks like Spring Boot, allowing you to protect your </w:t>
-      </w:r>
-      <w:proofErr w:type="spellStart"/>
-      <w:r>
-        <w:t>microservices</w:t>
-      </w:r>
-      <w:proofErr w:type="spellEnd"/>
-      <w:r>
-        <w:t xml:space="preserve"> from failures and improve overall system stability.</w:t>
-      </w:r>
-      <w:r>
-        <w:br/>
-      </w:r>
-      <w:r>
-        <w:br/>
-      </w:r>
-      <w:r>
-        <w:t xml:space="preserve">We will apply the circuit breaker pattern across all </w:t>
-      </w:r>
-      <w:proofErr w:type="spellStart"/>
-      <w:r>
-        <w:t>microservices</w:t>
-      </w:r>
-      <w:proofErr w:type="spellEnd"/>
-      <w:r>
-        <w:t>.</w:t>
-      </w:r>
-    </w:p>
-    <w:p>
-      <w:pPr>
-        <w:pStyle w:val="NormalWeb"/>
-      </w:pPr>
-      <w:r>
-        <w:rPr>
-          <w:rFonts w:cstheme="minorHAnsi"/>
-        </w:rPr>
-        <w:t xml:space="preserve">These are the 3 </w:t>
-      </w:r>
-      <w:proofErr w:type="spellStart"/>
-      <w:r>
-        <w:rPr>
-          <w:rFonts w:cstheme="minorHAnsi"/>
-        </w:rPr>
-        <w:t>posible</w:t>
-      </w:r>
-      <w:proofErr w:type="spellEnd"/>
-      <w:r>
-        <w:rPr>
-          <w:rFonts w:cstheme="minorHAnsi"/>
-        </w:rPr>
-        <w:t xml:space="preserve"> states for the circuit breaker</w:t>
-      </w:r>
-      <w:r>
-        <w:rPr>
-          <w:rFonts w:cstheme="minorHAnsi"/>
-        </w:rPr>
-        <w:br/>
-      </w:r>
-      <w:r>
-        <w:rPr>
-          <w:rFonts w:cstheme="minorHAnsi"/>
-        </w:rPr>
-        <w:br/>
-      </w:r>
-      <w:r>
-        <w:rPr>
-          <w:rFonts w:cstheme="minorHAnsi"/>
-        </w:rPr>
         <w:drawing>
-          <wp:inline distT="0" distB="0" distL="0" distR="0" wp14:anchorId="1FF98FAC" wp14:editId="38BCEA01">
-            <wp:extent cx="2833884" cy="2900721"/>
-            <wp:effectExtent l="0" t="0" r="5080" b="0"/>
-            <wp:docPr id="26" name="Imagen 26"/>
+          <wp:inline distT="0" distB="0" distL="0" distR="0" wp14:anchorId="2B02175D" wp14:editId="33E693C0">
+            <wp:extent cx="5400040" cy="3242310"/>
+            <wp:effectExtent l="0" t="0" r="0" b="0"/>
+            <wp:docPr id="32" name="Imagen 32"/>
             <wp:cNvGraphicFramePr>
               <a:graphicFrameLocks xmlns:a="http://schemas.openxmlformats.org/drawingml/2006/main" noChangeAspect="1"/>
             </wp:cNvGraphicFramePr>
@@ -4582,7 +4403,7 @@
                   <pic:spPr>
                     <a:xfrm>
                       <a:off x="0" y="0"/>
-                      <a:ext cx="2848197" cy="2915371"/>
+                      <a:ext cx="5400040" cy="3242310"/>
                     </a:xfrm>
                     <a:prstGeom prst="rect">
                       <a:avLst/>
@@ -4596,394 +4417,22 @@
       </w:r>
       <w:r>
         <w:rPr>
-          <w:rFonts w:cstheme="minorHAnsi"/>
-        </w:rPr>
-        <w:br/>
-      </w:r>
-      <w:r>
-        <w:rPr>
-          <w:rFonts w:cstheme="minorHAnsi"/>
-        </w:rPr>
-        <w:br/>
-      </w:r>
-      <w:r>
-        <w:rPr>
-          <w:rFonts w:hAnsi="Symbol"/>
-        </w:rPr>
-        <w:t></w:t>
-      </w:r>
-      <w:r>
-        <w:t xml:space="preserve">  </w:t>
-      </w:r>
-      <w:r>
-        <w:rPr>
-          <w:b/>
-          <w:bCs/>
-        </w:rPr>
-        <w:t>Closed</w:t>
-      </w:r>
-      <w:r>
-        <w:t xml:space="preserve"> </w:t>
-      </w:r>
-      <w:r>
-        <w:rPr>
-          <w:rFonts w:ascii="Segoe UI Symbol" w:hAnsi="Segoe UI Symbol" w:cs="Segoe UI Symbol"/>
-        </w:rPr>
-        <w:t>✅</w:t>
-      </w:r>
-      <w:r>
-        <w:br/>
-        <w:t xml:space="preserve">All requests are allowed. If the failure rate exceeds the threshold (e.g., 50%) based on the last N calls, the state transitions to </w:t>
-      </w:r>
-      <w:r>
-        <w:rPr>
-          <w:b/>
-          <w:bCs/>
-        </w:rPr>
-        <w:t>Open</w:t>
-      </w:r>
-      <w:r>
-        <w:t>.</w:t>
-      </w:r>
-    </w:p>
-    <w:p>
-      <w:pPr>
-        <w:spacing w:before="100" w:beforeAutospacing="1" w:after="100" w:afterAutospacing="1" w:line="240" w:lineRule="auto"/>
-        <w:rPr>
-          <w:rFonts w:ascii="Times New Roman" w:eastAsia="Times New Roman" w:hAnsi="Times New Roman" w:cs="Times New Roman"/>
-          <w:sz w:val="24"/>
-          <w:szCs w:val="24"/>
-          <w:lang w:eastAsia="en-GB"/>
-        </w:rPr>
-      </w:pPr>
-      <w:r>
-        <w:rPr>
-          <w:rFonts w:ascii="Times New Roman" w:eastAsia="Times New Roman" w:hAnsi="Symbol" w:cs="Times New Roman"/>
-          <w:sz w:val="24"/>
-          <w:szCs w:val="24"/>
-          <w:lang w:eastAsia="en-GB"/>
-        </w:rPr>
-        <w:t></w:t>
-      </w:r>
-      <w:r>
-        <w:rPr>
-          <w:rFonts w:ascii="Times New Roman" w:eastAsia="Times New Roman" w:hAnsi="Times New Roman" w:cs="Times New Roman"/>
-          <w:sz w:val="24"/>
-          <w:szCs w:val="24"/>
-          <w:lang w:eastAsia="en-GB"/>
-        </w:rPr>
-        <w:t xml:space="preserve">  </w:t>
-      </w:r>
-      <w:r>
-        <w:rPr>
-          <w:rFonts w:ascii="Times New Roman" w:eastAsia="Times New Roman" w:hAnsi="Times New Roman" w:cs="Times New Roman"/>
-          <w:b/>
-          <w:bCs/>
-          <w:sz w:val="24"/>
-          <w:szCs w:val="24"/>
-          <w:lang w:eastAsia="en-GB"/>
-        </w:rPr>
-        <w:t>Open</w:t>
-      </w:r>
-      <w:r>
-        <w:rPr>
-          <w:rFonts w:ascii="Times New Roman" w:eastAsia="Times New Roman" w:hAnsi="Times New Roman" w:cs="Times New Roman"/>
-          <w:sz w:val="24"/>
-          <w:szCs w:val="24"/>
-          <w:lang w:eastAsia="en-GB"/>
-        </w:rPr>
-        <w:t xml:space="preserve"> </w:t>
-      </w:r>
-      <w:r>
-        <w:rPr>
-          <w:rFonts w:ascii="Segoe UI Symbol" w:eastAsia="Times New Roman" w:hAnsi="Segoe UI Symbol" w:cs="Segoe UI Symbol"/>
-          <w:sz w:val="24"/>
-          <w:szCs w:val="24"/>
-          <w:lang w:eastAsia="en-GB"/>
-        </w:rPr>
-        <w:t>❌</w:t>
-      </w:r>
-      <w:r>
-        <w:rPr>
-          <w:rFonts w:ascii="Times New Roman" w:eastAsia="Times New Roman" w:hAnsi="Times New Roman" w:cs="Times New Roman"/>
-          <w:sz w:val="24"/>
-          <w:szCs w:val="24"/>
-          <w:lang w:eastAsia="en-GB"/>
-        </w:rPr>
-        <w:br/>
-        <w:t xml:space="preserve">No requests are allowed. The Circuit Breaker waits for a configured </w:t>
-      </w:r>
-      <w:proofErr w:type="spellStart"/>
-      <w:r>
-        <w:rPr>
-          <w:rFonts w:ascii="Times New Roman" w:eastAsia="Times New Roman" w:hAnsi="Times New Roman" w:cs="Times New Roman"/>
-          <w:b/>
-          <w:bCs/>
-          <w:sz w:val="24"/>
-          <w:szCs w:val="24"/>
-          <w:lang w:eastAsia="en-GB"/>
-        </w:rPr>
-        <w:t>cooldown</w:t>
-      </w:r>
-      <w:proofErr w:type="spellEnd"/>
-      <w:r>
-        <w:rPr>
-          <w:rFonts w:ascii="Times New Roman" w:eastAsia="Times New Roman" w:hAnsi="Times New Roman" w:cs="Times New Roman"/>
-          <w:b/>
-          <w:bCs/>
-          <w:sz w:val="24"/>
-          <w:szCs w:val="24"/>
-          <w:lang w:eastAsia="en-GB"/>
-        </w:rPr>
-        <w:t xml:space="preserve"> period</w:t>
-      </w:r>
-      <w:r>
-        <w:rPr>
-          <w:rFonts w:ascii="Times New Roman" w:eastAsia="Times New Roman" w:hAnsi="Times New Roman" w:cs="Times New Roman"/>
-          <w:sz w:val="24"/>
-          <w:szCs w:val="24"/>
-          <w:lang w:eastAsia="en-GB"/>
-        </w:rPr>
-        <w:t xml:space="preserve"> (</w:t>
-      </w:r>
-      <w:proofErr w:type="spellStart"/>
-      <w:r>
-        <w:rPr>
-          <w:rFonts w:ascii="Courier New" w:eastAsia="Times New Roman" w:hAnsi="Courier New" w:cs="Courier New"/>
-          <w:sz w:val="20"/>
-          <w:szCs w:val="20"/>
-          <w:lang w:eastAsia="en-GB"/>
-        </w:rPr>
-        <w:t>waitDurationInOpenState</w:t>
-      </w:r>
-      <w:proofErr w:type="spellEnd"/>
-      <w:r>
-        <w:rPr>
-          <w:rFonts w:ascii="Times New Roman" w:eastAsia="Times New Roman" w:hAnsi="Times New Roman" w:cs="Times New Roman"/>
-          <w:sz w:val="24"/>
-          <w:szCs w:val="24"/>
-          <w:lang w:eastAsia="en-GB"/>
-        </w:rPr>
-        <w:t xml:space="preserve">). After that, it moves to </w:t>
-      </w:r>
-      <w:r>
-        <w:rPr>
-          <w:rFonts w:ascii="Times New Roman" w:eastAsia="Times New Roman" w:hAnsi="Times New Roman" w:cs="Times New Roman"/>
-          <w:b/>
-          <w:bCs/>
-          <w:sz w:val="24"/>
-          <w:szCs w:val="24"/>
-          <w:lang w:eastAsia="en-GB"/>
-        </w:rPr>
-        <w:t>Half-Open</w:t>
-      </w:r>
-      <w:r>
-        <w:rPr>
-          <w:rFonts w:ascii="Times New Roman" w:eastAsia="Times New Roman" w:hAnsi="Times New Roman" w:cs="Times New Roman"/>
-          <w:sz w:val="24"/>
-          <w:szCs w:val="24"/>
-          <w:lang w:eastAsia="en-GB"/>
-        </w:rPr>
-        <w:t>.</w:t>
-      </w:r>
-    </w:p>
-    <w:p>
-      <w:pPr>
-        <w:spacing w:before="100" w:beforeAutospacing="1" w:after="100" w:afterAutospacing="1" w:line="240" w:lineRule="auto"/>
-        <w:rPr>
-          <w:rFonts w:ascii="Times New Roman" w:eastAsia="Times New Roman" w:hAnsi="Times New Roman" w:cs="Times New Roman"/>
-          <w:sz w:val="24"/>
-          <w:szCs w:val="24"/>
-          <w:lang w:eastAsia="en-GB"/>
-        </w:rPr>
-      </w:pPr>
-      <w:r>
-        <w:rPr>
-          <w:rFonts w:ascii="Times New Roman" w:eastAsia="Times New Roman" w:hAnsi="Symbol" w:cs="Times New Roman"/>
-          <w:sz w:val="24"/>
-          <w:szCs w:val="24"/>
-          <w:lang w:eastAsia="en-GB"/>
-        </w:rPr>
-        <w:t></w:t>
-      </w:r>
-      <w:r>
-        <w:rPr>
-          <w:rFonts w:ascii="Times New Roman" w:eastAsia="Times New Roman" w:hAnsi="Times New Roman" w:cs="Times New Roman"/>
-          <w:sz w:val="24"/>
-          <w:szCs w:val="24"/>
-          <w:lang w:eastAsia="en-GB"/>
-        </w:rPr>
-        <w:t xml:space="preserve">  </w:t>
-      </w:r>
-      <w:r>
-        <w:rPr>
-          <w:rFonts w:ascii="Times New Roman" w:eastAsia="Times New Roman" w:hAnsi="Times New Roman" w:cs="Times New Roman"/>
-          <w:b/>
-          <w:bCs/>
-          <w:sz w:val="24"/>
-          <w:szCs w:val="24"/>
-          <w:lang w:eastAsia="en-GB"/>
-        </w:rPr>
-        <w:t>Half-Open</w:t>
-      </w:r>
-      <w:r>
-        <w:rPr>
-          <w:rFonts w:ascii="Times New Roman" w:eastAsia="Times New Roman" w:hAnsi="Times New Roman" w:cs="Times New Roman"/>
-          <w:sz w:val="24"/>
-          <w:szCs w:val="24"/>
-          <w:lang w:eastAsia="en-GB"/>
-        </w:rPr>
-        <w:t xml:space="preserve"> </w:t>
-      </w:r>
-      <w:r>
-        <w:rPr>
-          <w:rFonts w:ascii="Segoe UI Symbol" w:eastAsia="Times New Roman" w:hAnsi="Segoe UI Symbol" w:cs="Segoe UI Symbol"/>
-          <w:sz w:val="24"/>
-          <w:szCs w:val="24"/>
-          <w:lang w:eastAsia="en-GB"/>
-        </w:rPr>
-        <w:t>⚠️</w:t>
-      </w:r>
-      <w:r>
-        <w:rPr>
-          <w:rFonts w:ascii="Times New Roman" w:eastAsia="Times New Roman" w:hAnsi="Times New Roman" w:cs="Times New Roman"/>
-          <w:sz w:val="24"/>
-          <w:szCs w:val="24"/>
-          <w:lang w:eastAsia="en-GB"/>
-        </w:rPr>
-        <w:br/>
-        <w:t>A limited number of test requests are allowed:</w:t>
-      </w:r>
-    </w:p>
-    <w:p>
-      <w:pPr>
-        <w:numPr>
-          <w:ilvl w:val="0"/>
-          <w:numId w:val="6"/>
-        </w:numPr>
-        <w:spacing w:before="100" w:beforeAutospacing="1" w:after="100" w:afterAutospacing="1" w:line="240" w:lineRule="auto"/>
-        <w:rPr>
-          <w:rFonts w:ascii="Times New Roman" w:eastAsia="Times New Roman" w:hAnsi="Times New Roman" w:cs="Times New Roman"/>
-          <w:sz w:val="24"/>
-          <w:szCs w:val="24"/>
-          <w:lang w:eastAsia="en-GB"/>
-        </w:rPr>
-      </w:pPr>
-      <w:r>
-        <w:rPr>
-          <w:rFonts w:ascii="Times New Roman" w:eastAsia="Times New Roman" w:hAnsi="Times New Roman" w:cs="Times New Roman"/>
-          <w:sz w:val="24"/>
-          <w:szCs w:val="24"/>
-          <w:lang w:eastAsia="en-GB"/>
-        </w:rPr>
-        <w:t xml:space="preserve">If they succeed → the breaker </w:t>
-      </w:r>
-      <w:r>
-        <w:rPr>
-          <w:rFonts w:ascii="Times New Roman" w:eastAsia="Times New Roman" w:hAnsi="Times New Roman" w:cs="Times New Roman"/>
-          <w:b/>
-          <w:bCs/>
-          <w:sz w:val="24"/>
-          <w:szCs w:val="24"/>
-          <w:lang w:eastAsia="en-GB"/>
-        </w:rPr>
-        <w:t>closes</w:t>
-      </w:r>
-      <w:r>
-        <w:rPr>
-          <w:rFonts w:ascii="Times New Roman" w:eastAsia="Times New Roman" w:hAnsi="Times New Roman" w:cs="Times New Roman"/>
-          <w:sz w:val="24"/>
-          <w:szCs w:val="24"/>
-          <w:lang w:eastAsia="en-GB"/>
-        </w:rPr>
-        <w:t xml:space="preserve"> (healthy again).</w:t>
-      </w:r>
-    </w:p>
-    <w:p>
-      <w:pPr>
-        <w:numPr>
-          <w:ilvl w:val="0"/>
-          <w:numId w:val="6"/>
-        </w:numPr>
-        <w:spacing w:before="100" w:beforeAutospacing="1" w:after="100" w:afterAutospacing="1" w:line="240" w:lineRule="auto"/>
-        <w:rPr>
-          <w:rFonts w:ascii="Times New Roman" w:eastAsia="Times New Roman" w:hAnsi="Times New Roman" w:cs="Times New Roman"/>
-          <w:sz w:val="24"/>
-          <w:szCs w:val="24"/>
-          <w:lang w:eastAsia="en-GB"/>
-        </w:rPr>
-      </w:pPr>
-      <w:r>
-        <w:rPr>
-          <w:rFonts w:ascii="Times New Roman" w:eastAsia="Times New Roman" w:hAnsi="Times New Roman" w:cs="Times New Roman"/>
-          <w:sz w:val="24"/>
-          <w:szCs w:val="24"/>
-          <w:lang w:eastAsia="en-GB"/>
-        </w:rPr>
-        <w:t xml:space="preserve">If any fail → it goes back to </w:t>
-      </w:r>
-      <w:r>
-        <w:rPr>
-          <w:rFonts w:ascii="Times New Roman" w:eastAsia="Times New Roman" w:hAnsi="Times New Roman" w:cs="Times New Roman"/>
-          <w:b/>
-          <w:bCs/>
-          <w:sz w:val="24"/>
-          <w:szCs w:val="24"/>
-          <w:lang w:eastAsia="en-GB"/>
-        </w:rPr>
-        <w:t>Open</w:t>
-      </w:r>
-      <w:r>
-        <w:rPr>
-          <w:rFonts w:ascii="Times New Roman" w:eastAsia="Times New Roman" w:hAnsi="Times New Roman" w:cs="Times New Roman"/>
-          <w:sz w:val="24"/>
-          <w:szCs w:val="24"/>
-          <w:lang w:eastAsia="en-GB"/>
-        </w:rPr>
-        <w:t>.</w:t>
-      </w:r>
-    </w:p>
-    <w:p>
-      <w:r>
-        <w:rPr>
-          <w:rFonts w:eastAsia="Times New Roman" w:cstheme="minorHAnsi"/>
-          <w:sz w:val="24"/>
-          <w:szCs w:val="24"/>
-          <w:lang w:eastAsia="en-GB"/>
-        </w:rPr>
-        <w:br/>
-      </w:r>
-      <w:r>
-        <w:rPr>
-          <w:rFonts w:eastAsia="Times New Roman" w:cstheme="minorHAnsi"/>
-          <w:sz w:val="24"/>
-          <w:szCs w:val="24"/>
-          <w:lang w:eastAsia="en-GB"/>
-        </w:rPr>
-        <w:br/>
-      </w:r>
-      <w:r>
-        <w:rPr>
-          <w:rFonts w:eastAsia="Times New Roman" w:cstheme="minorHAnsi"/>
-          <w:sz w:val="24"/>
-          <w:szCs w:val="24"/>
-          <w:lang w:eastAsia="en-GB"/>
-        </w:rPr>
-        <w:br/>
-      </w:r>
-      <w:r>
-        <w:rPr>
-          <w:rFonts w:eastAsia="Times New Roman" w:cstheme="minorHAnsi"/>
-          <w:sz w:val="24"/>
-          <w:szCs w:val="24"/>
-          <w:lang w:eastAsia="en-GB"/>
-        </w:rPr>
-        <w:lastRenderedPageBreak/>
+          <w:sz w:val="24"/>
+        </w:rPr>
+        <w:br/>
+      </w:r>
+      <w:r>
+        <w:rPr>
+          <w:rFonts w:eastAsia="Times New Roman" w:cstheme="minorHAnsi"/>
+          <w:sz w:val="24"/>
+          <w:szCs w:val="24"/>
+          <w:lang w:eastAsia="en-GB"/>
+        </w:rPr>
         <w:drawing>
-          <wp:inline distT="0" distB="0" distL="0" distR="0" wp14:anchorId="1542A9A0" wp14:editId="34A7C9D3">
-            <wp:extent cx="5400040" cy="3368675"/>
-            <wp:effectExtent l="0" t="0" r="0" b="3175"/>
-            <wp:docPr id="27" name="Imagen 27"/>
+          <wp:inline distT="0" distB="0" distL="0" distR="0" wp14:anchorId="6DC39474" wp14:editId="60F4973E">
+            <wp:extent cx="5400040" cy="1560195"/>
+            <wp:effectExtent l="0" t="0" r="0" b="1905"/>
+            <wp:docPr id="33" name="Imagen 33"/>
             <wp:cNvGraphicFramePr>
               <a:graphicFrameLocks xmlns:a="http://schemas.openxmlformats.org/drawingml/2006/main" noChangeAspect="1"/>
             </wp:cNvGraphicFramePr>
@@ -5003,7 +4452,7 @@
                   <pic:spPr>
                     <a:xfrm>
                       <a:off x="0" y="0"/>
-                      <a:ext cx="5400040" cy="3368675"/>
+                      <a:ext cx="5400040" cy="1560195"/>
                     </a:xfrm>
                     <a:prstGeom prst="rect">
                       <a:avLst/>
@@ -5017,38 +4466,39 @@
       </w:r>
       <w:r>
         <w:rPr>
-          <w:rFonts w:eastAsia="Times New Roman" w:cstheme="minorHAnsi"/>
-          <w:sz w:val="24"/>
-          <w:szCs w:val="24"/>
-          <w:lang w:eastAsia="en-GB"/>
-        </w:rPr>
-        <w:br/>
-      </w:r>
-      <w:r>
-        <w:rPr>
-          <w:rFonts w:eastAsia="Times New Roman" w:cstheme="minorHAnsi"/>
-          <w:sz w:val="24"/>
-          <w:szCs w:val="24"/>
-          <w:lang w:eastAsia="en-GB"/>
-        </w:rPr>
-        <w:br/>
-        <w:t>If we stop one of our services, and try to send a request, the circuit breaker will update its status to “UP”, and we will be able to see it through the actuator endpoint</w:t>
-      </w:r>
-      <w:r>
-        <w:rPr>
-          <w:rFonts w:eastAsia="Times New Roman" w:cstheme="minorHAnsi"/>
-          <w:sz w:val="24"/>
-          <w:szCs w:val="24"/>
-          <w:lang w:eastAsia="en-GB"/>
-        </w:rPr>
-        <w:br/>
-      </w:r>
-      <w:r>
-        <w:rPr>
-          <w:rFonts w:eastAsia="Times New Roman" w:cstheme="minorHAnsi"/>
-          <w:sz w:val="24"/>
-          <w:szCs w:val="24"/>
-          <w:lang w:eastAsia="en-GB"/>
+          <w:sz w:val="24"/>
+        </w:rPr>
+        <w:br/>
+      </w:r>
+      <w:r>
+        <w:rPr>
+          <w:sz w:val="24"/>
+        </w:rPr>
+        <w:br/>
+      </w:r>
+      <w:r>
+        <w:rPr>
+          <w:sz w:val="24"/>
+        </w:rPr>
+        <w:lastRenderedPageBreak/>
+        <w:t>We can also activate the user registration option in our realm settings.</w:t>
+      </w:r>
+    </w:p>
+    <w:p>
+      <w:pPr>
+        <w:spacing w:before="100" w:beforeAutospacing="1" w:after="100" w:afterAutospacing="1" w:line="240" w:lineRule="auto"/>
+        <w:rPr>
+          <w:rFonts w:eastAsia="Times New Roman" w:cstheme="minorHAnsi"/>
+          <w:sz w:val="24"/>
+          <w:szCs w:val="24"/>
+          <w:lang w:eastAsia="en-GB"/>
+        </w:rPr>
+      </w:pPr>
+      <w:bookmarkStart w:id="0" w:name="_GoBack"/>
+      <w:bookmarkEnd w:id="0"/>
+      <w:r>
+        <w:rPr>
+          <w:sz w:val="24"/>
         </w:rPr>
         <w:br/>
       </w:r>
@@ -5060,10 +4510,10 @@
           <w:lang w:eastAsia="en-GB"/>
         </w:rPr>
         <w:drawing>
-          <wp:inline distT="0" distB="0" distL="0" distR="0" wp14:anchorId="5721A4CC" wp14:editId="14E31EBE">
-            <wp:extent cx="5400040" cy="3305175"/>
-            <wp:effectExtent l="0" t="0" r="0" b="9525"/>
-            <wp:docPr id="28" name="Imagen 28"/>
+          <wp:inline distT="0" distB="0" distL="0" distR="0" wp14:anchorId="725F874B" wp14:editId="1FE8D145">
+            <wp:extent cx="3658603" cy="3773042"/>
+            <wp:effectExtent l="0" t="0" r="0" b="0"/>
+            <wp:docPr id="34" name="Imagen 34"/>
             <wp:cNvGraphicFramePr>
               <a:graphicFrameLocks xmlns:a="http://schemas.openxmlformats.org/drawingml/2006/main" noChangeAspect="1"/>
             </wp:cNvGraphicFramePr>
@@ -5083,7 +4533,7 @@
                   <pic:spPr>
                     <a:xfrm>
                       <a:off x="0" y="0"/>
-                      <a:ext cx="5400040" cy="3305175"/>
+                      <a:ext cx="3667482" cy="3782198"/>
                     </a:xfrm>
                     <a:prstGeom prst="rect">
                       <a:avLst/>
@@ -5095,62 +4545,61 @@
           </wp:inline>
         </w:drawing>
       </w:r>
-      <w:r>
-        <w:rPr>
-          <w:rFonts w:eastAsia="Times New Roman" w:cstheme="minorHAnsi"/>
-          <w:sz w:val="24"/>
-          <w:szCs w:val="24"/>
-          <w:lang w:eastAsia="en-GB"/>
-        </w:rPr>
-        <w:br/>
-      </w:r>
-      <w:r>
-        <w:rPr>
-          <w:rFonts w:eastAsia="Times New Roman" w:cstheme="minorHAnsi"/>
-          <w:sz w:val="24"/>
-          <w:szCs w:val="24"/>
-          <w:lang w:eastAsia="en-GB"/>
-        </w:rPr>
-        <w:br/>
-      </w:r>
-      <w:r>
-        <w:rPr>
-          <w:sz w:val="24"/>
-        </w:rPr>
-        <w:t>After enabling the actuator and the circuit breaker, we can monitor various metrics through the actuator endpoint, including the circuit breaker status.</w:t>
-      </w:r>
-      <w:r>
-        <w:rPr>
-          <w:sz w:val="24"/>
-        </w:rPr>
-        <w:br/>
-        <w:t>Since we configured the circuit breaker to require a minimum of 5 failed requests before changing its status to OPEN, if we force 5 requests while the service is down and then access the actuator endpoint, we can verify that the status is now "OPEN".</w:t>
-      </w:r>
-      <w:r>
-        <w:rPr>
-          <w:sz w:val="24"/>
-        </w:rPr>
-        <w:br/>
-      </w:r>
-      <w:r>
-        <w:rPr>
-          <w:sz w:val="24"/>
-        </w:rPr>
-        <w:lastRenderedPageBreak/>
-        <w:br/>
-      </w:r>
-      <w:r>
-        <w:rPr>
-          <w:rFonts w:eastAsia="Times New Roman" w:cstheme="minorHAnsi"/>
-          <w:sz w:val="24"/>
-          <w:szCs w:val="24"/>
-          <w:lang w:eastAsia="en-GB"/>
+    </w:p>
+    <w:p>
+      <w:pPr>
+        <w:pStyle w:val="Ttulo1"/>
+        <w:rPr>
+          <w:rStyle w:val="Ttulo1Car"/>
+          <w:rFonts w:asciiTheme="minorHAnsi" w:hAnsiTheme="minorHAnsi" w:cstheme="minorHAnsi"/>
+        </w:rPr>
+      </w:pPr>
+      <w:r>
+        <w:rPr>
+          <w:rStyle w:val="Ttulo1Car"/>
+          <w:rFonts w:asciiTheme="minorHAnsi" w:hAnsiTheme="minorHAnsi" w:cstheme="minorHAnsi"/>
+        </w:rPr>
+        <w:t xml:space="preserve">7 </w:t>
+      </w:r>
+      <w:r>
+        <w:rPr>
+          <w:rStyle w:val="Ttulo1Car"/>
+          <w:rFonts w:asciiTheme="minorHAnsi" w:hAnsiTheme="minorHAnsi" w:cstheme="minorHAnsi"/>
+        </w:rPr>
+        <w:t>-</w:t>
+      </w:r>
+      <w:r>
+        <w:rPr>
+          <w:rStyle w:val="Ttulo1Car"/>
+          <w:rFonts w:asciiTheme="minorHAnsi" w:hAnsiTheme="minorHAnsi" w:cstheme="minorHAnsi"/>
+        </w:rPr>
+        <w:t xml:space="preserve"> Circuit breaker</w:t>
+      </w:r>
+      <w:r>
+        <w:rPr>
+          <w:rStyle w:val="Ttulo1Car"/>
+          <w:rFonts w:asciiTheme="minorHAnsi" w:hAnsiTheme="minorHAnsi" w:cstheme="minorHAnsi"/>
+        </w:rPr>
+        <w:br/>
+      </w:r>
+    </w:p>
+    <w:p>
+      <w:pPr>
+        <w:rPr>
+          <w:rFonts w:cstheme="minorHAnsi"/>
+          <w:sz w:val="24"/>
+        </w:rPr>
+      </w:pPr>
+      <w:r>
+        <w:rPr>
+          <w:rStyle w:val="Ttulo1Car"/>
+          <w:rFonts w:asciiTheme="minorHAnsi" w:hAnsiTheme="minorHAnsi" w:cstheme="minorHAnsi"/>
         </w:rPr>
         <w:drawing>
-          <wp:inline distT="0" distB="0" distL="0" distR="0" wp14:anchorId="1C782626" wp14:editId="5096EDDE">
-            <wp:extent cx="5039428" cy="3162741"/>
-            <wp:effectExtent l="0" t="0" r="8890" b="0"/>
-            <wp:docPr id="29" name="Imagen 29"/>
+          <wp:inline distT="0" distB="0" distL="0" distR="0" wp14:anchorId="0DE0EC73" wp14:editId="4503E34D">
+            <wp:extent cx="5400040" cy="2410460"/>
+            <wp:effectExtent l="0" t="0" r="0" b="8890"/>
+            <wp:docPr id="25" name="Imagen 25"/>
             <wp:cNvGraphicFramePr>
               <a:graphicFrameLocks xmlns:a="http://schemas.openxmlformats.org/drawingml/2006/main" noChangeAspect="1"/>
             </wp:cNvGraphicFramePr>
@@ -5170,6 +4619,813 @@
                   <pic:spPr>
                     <a:xfrm>
                       <a:off x="0" y="0"/>
+                      <a:ext cx="5400040" cy="2410460"/>
+                    </a:xfrm>
+                    <a:prstGeom prst="rect">
+                      <a:avLst/>
+                    </a:prstGeom>
+                  </pic:spPr>
+                </pic:pic>
+              </a:graphicData>
+            </a:graphic>
+          </wp:inline>
+        </w:drawing>
+      </w:r>
+    </w:p>
+    <w:p>
+      <w:pPr>
+        <w:pStyle w:val="NormalWeb"/>
+      </w:pPr>
+      <w:r>
+        <w:rPr>
+          <w:rStyle w:val="Ttulo1Car"/>
+          <w:rFonts w:asciiTheme="minorHAnsi" w:hAnsiTheme="minorHAnsi" w:cstheme="minorHAnsi"/>
+        </w:rPr>
+        <w:br/>
+      </w:r>
+      <w:r>
+        <w:rPr>
+          <w:rFonts w:asciiTheme="minorHAnsi" w:hAnsiTheme="minorHAnsi" w:cstheme="minorHAnsi"/>
+        </w:rPr>
+        <w:t xml:space="preserve">A </w:t>
+      </w:r>
+      <w:r>
+        <w:rPr>
+          <w:rStyle w:val="Textoennegrita"/>
+          <w:rFonts w:asciiTheme="minorHAnsi" w:hAnsiTheme="minorHAnsi" w:cstheme="minorHAnsi"/>
+        </w:rPr>
+        <w:t>circuit breaker</w:t>
+      </w:r>
+      <w:r>
+        <w:rPr>
+          <w:rFonts w:asciiTheme="minorHAnsi" w:hAnsiTheme="minorHAnsi" w:cstheme="minorHAnsi"/>
+        </w:rPr>
+        <w:t xml:space="preserve"> is a design pattern used in </w:t>
+      </w:r>
+      <w:proofErr w:type="spellStart"/>
+      <w:r>
+        <w:rPr>
+          <w:rFonts w:asciiTheme="minorHAnsi" w:hAnsiTheme="minorHAnsi" w:cstheme="minorHAnsi"/>
+        </w:rPr>
+        <w:t>microservices</w:t>
+      </w:r>
+      <w:proofErr w:type="spellEnd"/>
+      <w:r>
+        <w:rPr>
+          <w:rFonts w:asciiTheme="minorHAnsi" w:hAnsiTheme="minorHAnsi" w:cstheme="minorHAnsi"/>
+        </w:rPr>
+        <w:t xml:space="preserve"> and distributed systems to improve reliability. It acts like a safety switch that stops requests to a failing service after a certain number of errors, preventing system overload and long wait times. After a </w:t>
+      </w:r>
+      <w:proofErr w:type="spellStart"/>
+      <w:r>
+        <w:rPr>
+          <w:rFonts w:asciiTheme="minorHAnsi" w:hAnsiTheme="minorHAnsi" w:cstheme="minorHAnsi"/>
+        </w:rPr>
+        <w:t>cooldown</w:t>
+      </w:r>
+      <w:proofErr w:type="spellEnd"/>
+      <w:r>
+        <w:rPr>
+          <w:rFonts w:asciiTheme="minorHAnsi" w:hAnsiTheme="minorHAnsi" w:cstheme="minorHAnsi"/>
+        </w:rPr>
+        <w:t xml:space="preserve"> period, it tests the service again to see if it has recovered, allowing requests to resume. This helps maintain overall system stability and resilience.</w:t>
+      </w:r>
+      <w:r>
+        <w:rPr>
+          <w:rFonts w:cstheme="minorHAnsi"/>
+        </w:rPr>
+        <w:br/>
+      </w:r>
+      <w:r>
+        <w:rPr>
+          <w:rFonts w:cstheme="minorHAnsi"/>
+        </w:rPr>
+        <w:lastRenderedPageBreak/>
+        <w:br/>
+      </w:r>
+      <w:r>
+        <w:rPr>
+          <w:rStyle w:val="Textoennegrita"/>
+        </w:rPr>
+        <w:t>Resilience4j</w:t>
+      </w:r>
+      <w:r>
+        <w:t xml:space="preserve"> is a lightweight, easy-to-use fault tolerance library for Java applications. It helps developers build resilient systems by providing common patterns like </w:t>
+      </w:r>
+      <w:r>
+        <w:rPr>
+          <w:rStyle w:val="Textoennegrita"/>
+        </w:rPr>
+        <w:t>circuit breakers</w:t>
+      </w:r>
+      <w:r>
+        <w:t xml:space="preserve">, </w:t>
+      </w:r>
+      <w:r>
+        <w:rPr>
+          <w:rStyle w:val="Textoennegrita"/>
+        </w:rPr>
+        <w:t>rate limiters</w:t>
+      </w:r>
+      <w:r>
+        <w:t xml:space="preserve">, </w:t>
+      </w:r>
+      <w:r>
+        <w:rPr>
+          <w:rStyle w:val="Textoennegrita"/>
+        </w:rPr>
+        <w:t>retry mechanisms</w:t>
+      </w:r>
+      <w:r>
+        <w:t xml:space="preserve">, and </w:t>
+      </w:r>
+      <w:r>
+        <w:rPr>
+          <w:rStyle w:val="Textoennegrita"/>
+        </w:rPr>
+        <w:t>bulkheads</w:t>
+      </w:r>
+      <w:r>
+        <w:t xml:space="preserve">. Resilience4j is designed to work well with modern Java frameworks like Spring Boot, allowing you to protect your </w:t>
+      </w:r>
+      <w:proofErr w:type="spellStart"/>
+      <w:r>
+        <w:t>microservices</w:t>
+      </w:r>
+      <w:proofErr w:type="spellEnd"/>
+      <w:r>
+        <w:t xml:space="preserve"> from failures and improve overall system stability.</w:t>
+      </w:r>
+      <w:r>
+        <w:br/>
+      </w:r>
+      <w:r>
+        <w:br/>
+      </w:r>
+      <w:r>
+        <w:t xml:space="preserve">We will apply the circuit breaker pattern across all </w:t>
+      </w:r>
+      <w:proofErr w:type="spellStart"/>
+      <w:r>
+        <w:t>microservices</w:t>
+      </w:r>
+      <w:proofErr w:type="spellEnd"/>
+      <w:r>
+        <w:t>.</w:t>
+      </w:r>
+    </w:p>
+    <w:p>
+      <w:pPr>
+        <w:pStyle w:val="NormalWeb"/>
+      </w:pPr>
+      <w:r>
+        <w:rPr>
+          <w:rFonts w:cstheme="minorHAnsi"/>
+        </w:rPr>
+        <w:t xml:space="preserve">These are the 3 </w:t>
+      </w:r>
+      <w:proofErr w:type="spellStart"/>
+      <w:r>
+        <w:rPr>
+          <w:rFonts w:cstheme="minorHAnsi"/>
+        </w:rPr>
+        <w:t>posible</w:t>
+      </w:r>
+      <w:proofErr w:type="spellEnd"/>
+      <w:r>
+        <w:rPr>
+          <w:rFonts w:cstheme="minorHAnsi"/>
+        </w:rPr>
+        <w:t xml:space="preserve"> states for the circuit breaker</w:t>
+      </w:r>
+      <w:r>
+        <w:rPr>
+          <w:rFonts w:cstheme="minorHAnsi"/>
+        </w:rPr>
+        <w:br/>
+      </w:r>
+      <w:r>
+        <w:rPr>
+          <w:rFonts w:cstheme="minorHAnsi"/>
+        </w:rPr>
+        <w:br/>
+      </w:r>
+      <w:r>
+        <w:rPr>
+          <w:rFonts w:cstheme="minorHAnsi"/>
+        </w:rPr>
+        <w:drawing>
+          <wp:inline distT="0" distB="0" distL="0" distR="0" wp14:anchorId="1FF98FAC" wp14:editId="38BCEA01">
+            <wp:extent cx="2833884" cy="2900721"/>
+            <wp:effectExtent l="0" t="0" r="5080" b="0"/>
+            <wp:docPr id="26" name="Imagen 26"/>
+            <wp:cNvGraphicFramePr>
+              <a:graphicFrameLocks xmlns:a="http://schemas.openxmlformats.org/drawingml/2006/main" noChangeAspect="1"/>
+            </wp:cNvGraphicFramePr>
+            <a:graphic xmlns:a="http://schemas.openxmlformats.org/drawingml/2006/main">
+              <a:graphicData uri="http://schemas.openxmlformats.org/drawingml/2006/picture">
+                <pic:pic xmlns:pic="http://schemas.openxmlformats.org/drawingml/2006/picture">
+                  <pic:nvPicPr>
+                    <pic:cNvPr id="1" name=""/>
+                    <pic:cNvPicPr/>
+                  </pic:nvPicPr>
+                  <pic:blipFill>
+                    <a:blip r:embed="rId33"/>
+                    <a:stretch>
+                      <a:fillRect/>
+                    </a:stretch>
+                  </pic:blipFill>
+                  <pic:spPr>
+                    <a:xfrm>
+                      <a:off x="0" y="0"/>
+                      <a:ext cx="2848197" cy="2915371"/>
+                    </a:xfrm>
+                    <a:prstGeom prst="rect">
+                      <a:avLst/>
+                    </a:prstGeom>
+                  </pic:spPr>
+                </pic:pic>
+              </a:graphicData>
+            </a:graphic>
+          </wp:inline>
+        </w:drawing>
+      </w:r>
+      <w:r>
+        <w:rPr>
+          <w:rFonts w:cstheme="minorHAnsi"/>
+        </w:rPr>
+        <w:br/>
+      </w:r>
+      <w:r>
+        <w:rPr>
+          <w:rFonts w:cstheme="minorHAnsi"/>
+        </w:rPr>
+        <w:br/>
+      </w:r>
+      <w:r>
+        <w:rPr>
+          <w:rFonts w:hAnsi="Symbol"/>
+        </w:rPr>
+        <w:t></w:t>
+      </w:r>
+      <w:r>
+        <w:t xml:space="preserve">  </w:t>
+      </w:r>
+      <w:r>
+        <w:rPr>
+          <w:b/>
+          <w:bCs/>
+        </w:rPr>
+        <w:t>Closed</w:t>
+      </w:r>
+      <w:r>
+        <w:t xml:space="preserve"> </w:t>
+      </w:r>
+      <w:r>
+        <w:rPr>
+          <w:rFonts w:ascii="Segoe UI Symbol" w:hAnsi="Segoe UI Symbol" w:cs="Segoe UI Symbol"/>
+        </w:rPr>
+        <w:t>✅</w:t>
+      </w:r>
+      <w:r>
+        <w:br/>
+        <w:t xml:space="preserve">All requests are allowed. If the failure rate exceeds the threshold (e.g., 50%) based on the last N calls, the state transitions to </w:t>
+      </w:r>
+      <w:r>
+        <w:rPr>
+          <w:b/>
+          <w:bCs/>
+        </w:rPr>
+        <w:t>Open</w:t>
+      </w:r>
+      <w:r>
+        <w:t>.</w:t>
+      </w:r>
+    </w:p>
+    <w:p>
+      <w:pPr>
+        <w:spacing w:before="100" w:beforeAutospacing="1" w:after="100" w:afterAutospacing="1" w:line="240" w:lineRule="auto"/>
+        <w:rPr>
+          <w:rFonts w:ascii="Times New Roman" w:eastAsia="Times New Roman" w:hAnsi="Times New Roman" w:cs="Times New Roman"/>
+          <w:sz w:val="24"/>
+          <w:szCs w:val="24"/>
+          <w:lang w:eastAsia="en-GB"/>
+        </w:rPr>
+      </w:pPr>
+      <w:r>
+        <w:rPr>
+          <w:rFonts w:ascii="Times New Roman" w:eastAsia="Times New Roman" w:hAnsi="Symbol" w:cs="Times New Roman"/>
+          <w:sz w:val="24"/>
+          <w:szCs w:val="24"/>
+          <w:lang w:eastAsia="en-GB"/>
+        </w:rPr>
+        <w:t></w:t>
+      </w:r>
+      <w:r>
+        <w:rPr>
+          <w:rFonts w:ascii="Times New Roman" w:eastAsia="Times New Roman" w:hAnsi="Times New Roman" w:cs="Times New Roman"/>
+          <w:sz w:val="24"/>
+          <w:szCs w:val="24"/>
+          <w:lang w:eastAsia="en-GB"/>
+        </w:rPr>
+        <w:t xml:space="preserve">  </w:t>
+      </w:r>
+      <w:r>
+        <w:rPr>
+          <w:rFonts w:ascii="Times New Roman" w:eastAsia="Times New Roman" w:hAnsi="Times New Roman" w:cs="Times New Roman"/>
+          <w:b/>
+          <w:bCs/>
+          <w:sz w:val="24"/>
+          <w:szCs w:val="24"/>
+          <w:lang w:eastAsia="en-GB"/>
+        </w:rPr>
+        <w:t>Open</w:t>
+      </w:r>
+      <w:r>
+        <w:rPr>
+          <w:rFonts w:ascii="Times New Roman" w:eastAsia="Times New Roman" w:hAnsi="Times New Roman" w:cs="Times New Roman"/>
+          <w:sz w:val="24"/>
+          <w:szCs w:val="24"/>
+          <w:lang w:eastAsia="en-GB"/>
+        </w:rPr>
+        <w:t xml:space="preserve"> </w:t>
+      </w:r>
+      <w:r>
+        <w:rPr>
+          <w:rFonts w:ascii="Segoe UI Symbol" w:eastAsia="Times New Roman" w:hAnsi="Segoe UI Symbol" w:cs="Segoe UI Symbol"/>
+          <w:sz w:val="24"/>
+          <w:szCs w:val="24"/>
+          <w:lang w:eastAsia="en-GB"/>
+        </w:rPr>
+        <w:t>❌</w:t>
+      </w:r>
+      <w:r>
+        <w:rPr>
+          <w:rFonts w:ascii="Times New Roman" w:eastAsia="Times New Roman" w:hAnsi="Times New Roman" w:cs="Times New Roman"/>
+          <w:sz w:val="24"/>
+          <w:szCs w:val="24"/>
+          <w:lang w:eastAsia="en-GB"/>
+        </w:rPr>
+        <w:br/>
+        <w:t xml:space="preserve">No requests are allowed. The Circuit Breaker waits for a configured </w:t>
+      </w:r>
+      <w:proofErr w:type="spellStart"/>
+      <w:r>
+        <w:rPr>
+          <w:rFonts w:ascii="Times New Roman" w:eastAsia="Times New Roman" w:hAnsi="Times New Roman" w:cs="Times New Roman"/>
+          <w:b/>
+          <w:bCs/>
+          <w:sz w:val="24"/>
+          <w:szCs w:val="24"/>
+          <w:lang w:eastAsia="en-GB"/>
+        </w:rPr>
+        <w:t>cooldown</w:t>
+      </w:r>
+      <w:proofErr w:type="spellEnd"/>
+      <w:r>
+        <w:rPr>
+          <w:rFonts w:ascii="Times New Roman" w:eastAsia="Times New Roman" w:hAnsi="Times New Roman" w:cs="Times New Roman"/>
+          <w:b/>
+          <w:bCs/>
+          <w:sz w:val="24"/>
+          <w:szCs w:val="24"/>
+          <w:lang w:eastAsia="en-GB"/>
+        </w:rPr>
+        <w:t xml:space="preserve"> period</w:t>
+      </w:r>
+      <w:r>
+        <w:rPr>
+          <w:rFonts w:ascii="Times New Roman" w:eastAsia="Times New Roman" w:hAnsi="Times New Roman" w:cs="Times New Roman"/>
+          <w:sz w:val="24"/>
+          <w:szCs w:val="24"/>
+          <w:lang w:eastAsia="en-GB"/>
+        </w:rPr>
+        <w:t xml:space="preserve"> (</w:t>
+      </w:r>
+      <w:proofErr w:type="spellStart"/>
+      <w:r>
+        <w:rPr>
+          <w:rFonts w:ascii="Courier New" w:eastAsia="Times New Roman" w:hAnsi="Courier New" w:cs="Courier New"/>
+          <w:sz w:val="20"/>
+          <w:szCs w:val="20"/>
+          <w:lang w:eastAsia="en-GB"/>
+        </w:rPr>
+        <w:t>waitDurationInOpenState</w:t>
+      </w:r>
+      <w:proofErr w:type="spellEnd"/>
+      <w:r>
+        <w:rPr>
+          <w:rFonts w:ascii="Times New Roman" w:eastAsia="Times New Roman" w:hAnsi="Times New Roman" w:cs="Times New Roman"/>
+          <w:sz w:val="24"/>
+          <w:szCs w:val="24"/>
+          <w:lang w:eastAsia="en-GB"/>
+        </w:rPr>
+        <w:t xml:space="preserve">). After that, it moves to </w:t>
+      </w:r>
+      <w:r>
+        <w:rPr>
+          <w:rFonts w:ascii="Times New Roman" w:eastAsia="Times New Roman" w:hAnsi="Times New Roman" w:cs="Times New Roman"/>
+          <w:b/>
+          <w:bCs/>
+          <w:sz w:val="24"/>
+          <w:szCs w:val="24"/>
+          <w:lang w:eastAsia="en-GB"/>
+        </w:rPr>
+        <w:t>Half-Open</w:t>
+      </w:r>
+      <w:r>
+        <w:rPr>
+          <w:rFonts w:ascii="Times New Roman" w:eastAsia="Times New Roman" w:hAnsi="Times New Roman" w:cs="Times New Roman"/>
+          <w:sz w:val="24"/>
+          <w:szCs w:val="24"/>
+          <w:lang w:eastAsia="en-GB"/>
+        </w:rPr>
+        <w:t>.</w:t>
+      </w:r>
+    </w:p>
+    <w:p>
+      <w:pPr>
+        <w:spacing w:before="100" w:beforeAutospacing="1" w:after="100" w:afterAutospacing="1" w:line="240" w:lineRule="auto"/>
+        <w:rPr>
+          <w:rFonts w:ascii="Times New Roman" w:eastAsia="Times New Roman" w:hAnsi="Times New Roman" w:cs="Times New Roman"/>
+          <w:sz w:val="24"/>
+          <w:szCs w:val="24"/>
+          <w:lang w:eastAsia="en-GB"/>
+        </w:rPr>
+      </w:pPr>
+      <w:r>
+        <w:rPr>
+          <w:rFonts w:ascii="Times New Roman" w:eastAsia="Times New Roman" w:hAnsi="Symbol" w:cs="Times New Roman"/>
+          <w:sz w:val="24"/>
+          <w:szCs w:val="24"/>
+          <w:lang w:eastAsia="en-GB"/>
+        </w:rPr>
+        <w:t></w:t>
+      </w:r>
+      <w:r>
+        <w:rPr>
+          <w:rFonts w:ascii="Times New Roman" w:eastAsia="Times New Roman" w:hAnsi="Times New Roman" w:cs="Times New Roman"/>
+          <w:sz w:val="24"/>
+          <w:szCs w:val="24"/>
+          <w:lang w:eastAsia="en-GB"/>
+        </w:rPr>
+        <w:t xml:space="preserve">  </w:t>
+      </w:r>
+      <w:r>
+        <w:rPr>
+          <w:rFonts w:ascii="Times New Roman" w:eastAsia="Times New Roman" w:hAnsi="Times New Roman" w:cs="Times New Roman"/>
+          <w:b/>
+          <w:bCs/>
+          <w:sz w:val="24"/>
+          <w:szCs w:val="24"/>
+          <w:lang w:eastAsia="en-GB"/>
+        </w:rPr>
+        <w:t>Half-Open</w:t>
+      </w:r>
+      <w:r>
+        <w:rPr>
+          <w:rFonts w:ascii="Times New Roman" w:eastAsia="Times New Roman" w:hAnsi="Times New Roman" w:cs="Times New Roman"/>
+          <w:sz w:val="24"/>
+          <w:szCs w:val="24"/>
+          <w:lang w:eastAsia="en-GB"/>
+        </w:rPr>
+        <w:t xml:space="preserve"> </w:t>
+      </w:r>
+      <w:r>
+        <w:rPr>
+          <w:rFonts w:ascii="Segoe UI Symbol" w:eastAsia="Times New Roman" w:hAnsi="Segoe UI Symbol" w:cs="Segoe UI Symbol"/>
+          <w:sz w:val="24"/>
+          <w:szCs w:val="24"/>
+          <w:lang w:eastAsia="en-GB"/>
+        </w:rPr>
+        <w:t>⚠️</w:t>
+      </w:r>
+      <w:r>
+        <w:rPr>
+          <w:rFonts w:ascii="Times New Roman" w:eastAsia="Times New Roman" w:hAnsi="Times New Roman" w:cs="Times New Roman"/>
+          <w:sz w:val="24"/>
+          <w:szCs w:val="24"/>
+          <w:lang w:eastAsia="en-GB"/>
+        </w:rPr>
+        <w:br/>
+        <w:t>A limited number of test requests are allowed:</w:t>
+      </w:r>
+    </w:p>
+    <w:p>
+      <w:pPr>
+        <w:numPr>
+          <w:ilvl w:val="0"/>
+          <w:numId w:val="6"/>
+        </w:numPr>
+        <w:spacing w:before="100" w:beforeAutospacing="1" w:after="100" w:afterAutospacing="1" w:line="240" w:lineRule="auto"/>
+        <w:rPr>
+          <w:rFonts w:ascii="Times New Roman" w:eastAsia="Times New Roman" w:hAnsi="Times New Roman" w:cs="Times New Roman"/>
+          <w:sz w:val="24"/>
+          <w:szCs w:val="24"/>
+          <w:lang w:eastAsia="en-GB"/>
+        </w:rPr>
+      </w:pPr>
+      <w:r>
+        <w:rPr>
+          <w:rFonts w:ascii="Times New Roman" w:eastAsia="Times New Roman" w:hAnsi="Times New Roman" w:cs="Times New Roman"/>
+          <w:sz w:val="24"/>
+          <w:szCs w:val="24"/>
+          <w:lang w:eastAsia="en-GB"/>
+        </w:rPr>
+        <w:t xml:space="preserve">If they succeed → the breaker </w:t>
+      </w:r>
+      <w:r>
+        <w:rPr>
+          <w:rFonts w:ascii="Times New Roman" w:eastAsia="Times New Roman" w:hAnsi="Times New Roman" w:cs="Times New Roman"/>
+          <w:b/>
+          <w:bCs/>
+          <w:sz w:val="24"/>
+          <w:szCs w:val="24"/>
+          <w:lang w:eastAsia="en-GB"/>
+        </w:rPr>
+        <w:t>closes</w:t>
+      </w:r>
+      <w:r>
+        <w:rPr>
+          <w:rFonts w:ascii="Times New Roman" w:eastAsia="Times New Roman" w:hAnsi="Times New Roman" w:cs="Times New Roman"/>
+          <w:sz w:val="24"/>
+          <w:szCs w:val="24"/>
+          <w:lang w:eastAsia="en-GB"/>
+        </w:rPr>
+        <w:t xml:space="preserve"> (healthy again).</w:t>
+      </w:r>
+    </w:p>
+    <w:p>
+      <w:pPr>
+        <w:numPr>
+          <w:ilvl w:val="0"/>
+          <w:numId w:val="6"/>
+        </w:numPr>
+        <w:spacing w:before="100" w:beforeAutospacing="1" w:after="100" w:afterAutospacing="1" w:line="240" w:lineRule="auto"/>
+        <w:rPr>
+          <w:rFonts w:ascii="Times New Roman" w:eastAsia="Times New Roman" w:hAnsi="Times New Roman" w:cs="Times New Roman"/>
+          <w:sz w:val="24"/>
+          <w:szCs w:val="24"/>
+          <w:lang w:eastAsia="en-GB"/>
+        </w:rPr>
+      </w:pPr>
+      <w:r>
+        <w:rPr>
+          <w:rFonts w:ascii="Times New Roman" w:eastAsia="Times New Roman" w:hAnsi="Times New Roman" w:cs="Times New Roman"/>
+          <w:sz w:val="24"/>
+          <w:szCs w:val="24"/>
+          <w:lang w:eastAsia="en-GB"/>
+        </w:rPr>
+        <w:t xml:space="preserve">If any fail → it goes back to </w:t>
+      </w:r>
+      <w:r>
+        <w:rPr>
+          <w:rFonts w:ascii="Times New Roman" w:eastAsia="Times New Roman" w:hAnsi="Times New Roman" w:cs="Times New Roman"/>
+          <w:b/>
+          <w:bCs/>
+          <w:sz w:val="24"/>
+          <w:szCs w:val="24"/>
+          <w:lang w:eastAsia="en-GB"/>
+        </w:rPr>
+        <w:t>Open</w:t>
+      </w:r>
+      <w:r>
+        <w:rPr>
+          <w:rFonts w:ascii="Times New Roman" w:eastAsia="Times New Roman" w:hAnsi="Times New Roman" w:cs="Times New Roman"/>
+          <w:sz w:val="24"/>
+          <w:szCs w:val="24"/>
+          <w:lang w:eastAsia="en-GB"/>
+        </w:rPr>
+        <w:t>.</w:t>
+      </w:r>
+    </w:p>
+    <w:p>
+      <w:r>
+        <w:rPr>
+          <w:rFonts w:eastAsia="Times New Roman" w:cstheme="minorHAnsi"/>
+          <w:sz w:val="24"/>
+          <w:szCs w:val="24"/>
+          <w:lang w:eastAsia="en-GB"/>
+        </w:rPr>
+        <w:br/>
+      </w:r>
+      <w:r>
+        <w:rPr>
+          <w:rFonts w:eastAsia="Times New Roman" w:cstheme="minorHAnsi"/>
+          <w:sz w:val="24"/>
+          <w:szCs w:val="24"/>
+          <w:lang w:eastAsia="en-GB"/>
+        </w:rPr>
+        <w:br/>
+      </w:r>
+      <w:r>
+        <w:rPr>
+          <w:rFonts w:eastAsia="Times New Roman" w:cstheme="minorHAnsi"/>
+          <w:sz w:val="24"/>
+          <w:szCs w:val="24"/>
+          <w:lang w:eastAsia="en-GB"/>
+        </w:rPr>
+        <w:br/>
+      </w:r>
+      <w:r>
+        <w:rPr>
+          <w:rFonts w:eastAsia="Times New Roman" w:cstheme="minorHAnsi"/>
+          <w:sz w:val="24"/>
+          <w:szCs w:val="24"/>
+          <w:lang w:eastAsia="en-GB"/>
+        </w:rPr>
+        <w:lastRenderedPageBreak/>
+        <w:drawing>
+          <wp:inline distT="0" distB="0" distL="0" distR="0" wp14:anchorId="1542A9A0" wp14:editId="34A7C9D3">
+            <wp:extent cx="5400040" cy="3368675"/>
+            <wp:effectExtent l="0" t="0" r="0" b="3175"/>
+            <wp:docPr id="27" name="Imagen 27"/>
+            <wp:cNvGraphicFramePr>
+              <a:graphicFrameLocks xmlns:a="http://schemas.openxmlformats.org/drawingml/2006/main" noChangeAspect="1"/>
+            </wp:cNvGraphicFramePr>
+            <a:graphic xmlns:a="http://schemas.openxmlformats.org/drawingml/2006/main">
+              <a:graphicData uri="http://schemas.openxmlformats.org/drawingml/2006/picture">
+                <pic:pic xmlns:pic="http://schemas.openxmlformats.org/drawingml/2006/picture">
+                  <pic:nvPicPr>
+                    <pic:cNvPr id="1" name=""/>
+                    <pic:cNvPicPr/>
+                  </pic:nvPicPr>
+                  <pic:blipFill>
+                    <a:blip r:embed="rId34"/>
+                    <a:stretch>
+                      <a:fillRect/>
+                    </a:stretch>
+                  </pic:blipFill>
+                  <pic:spPr>
+                    <a:xfrm>
+                      <a:off x="0" y="0"/>
+                      <a:ext cx="5400040" cy="3368675"/>
+                    </a:xfrm>
+                    <a:prstGeom prst="rect">
+                      <a:avLst/>
+                    </a:prstGeom>
+                  </pic:spPr>
+                </pic:pic>
+              </a:graphicData>
+            </a:graphic>
+          </wp:inline>
+        </w:drawing>
+      </w:r>
+      <w:r>
+        <w:rPr>
+          <w:rFonts w:eastAsia="Times New Roman" w:cstheme="minorHAnsi"/>
+          <w:sz w:val="24"/>
+          <w:szCs w:val="24"/>
+          <w:lang w:eastAsia="en-GB"/>
+        </w:rPr>
+        <w:br/>
+      </w:r>
+      <w:r>
+        <w:rPr>
+          <w:rFonts w:eastAsia="Times New Roman" w:cstheme="minorHAnsi"/>
+          <w:sz w:val="24"/>
+          <w:szCs w:val="24"/>
+          <w:lang w:eastAsia="en-GB"/>
+        </w:rPr>
+        <w:br/>
+        <w:t>If we stop one of our services, and try to send a request, the circuit breaker will update its status to “UP”, and we will be able to see it through the actuator endpoint</w:t>
+      </w:r>
+      <w:r>
+        <w:rPr>
+          <w:rFonts w:eastAsia="Times New Roman" w:cstheme="minorHAnsi"/>
+          <w:sz w:val="24"/>
+          <w:szCs w:val="24"/>
+          <w:lang w:eastAsia="en-GB"/>
+        </w:rPr>
+        <w:br/>
+      </w:r>
+      <w:r>
+        <w:rPr>
+          <w:rFonts w:eastAsia="Times New Roman" w:cstheme="minorHAnsi"/>
+          <w:sz w:val="24"/>
+          <w:szCs w:val="24"/>
+          <w:lang w:eastAsia="en-GB"/>
+        </w:rPr>
+        <w:br/>
+      </w:r>
+      <w:r>
+        <w:rPr>
+          <w:rFonts w:eastAsia="Times New Roman" w:cstheme="minorHAnsi"/>
+          <w:sz w:val="24"/>
+          <w:szCs w:val="24"/>
+          <w:lang w:eastAsia="en-GB"/>
+        </w:rPr>
+        <w:drawing>
+          <wp:inline distT="0" distB="0" distL="0" distR="0" wp14:anchorId="5721A4CC" wp14:editId="14E31EBE">
+            <wp:extent cx="5400040" cy="3305175"/>
+            <wp:effectExtent l="0" t="0" r="0" b="9525"/>
+            <wp:docPr id="28" name="Imagen 28"/>
+            <wp:cNvGraphicFramePr>
+              <a:graphicFrameLocks xmlns:a="http://schemas.openxmlformats.org/drawingml/2006/main" noChangeAspect="1"/>
+            </wp:cNvGraphicFramePr>
+            <a:graphic xmlns:a="http://schemas.openxmlformats.org/drawingml/2006/main">
+              <a:graphicData uri="http://schemas.openxmlformats.org/drawingml/2006/picture">
+                <pic:pic xmlns:pic="http://schemas.openxmlformats.org/drawingml/2006/picture">
+                  <pic:nvPicPr>
+                    <pic:cNvPr id="1" name=""/>
+                    <pic:cNvPicPr/>
+                  </pic:nvPicPr>
+                  <pic:blipFill>
+                    <a:blip r:embed="rId35"/>
+                    <a:stretch>
+                      <a:fillRect/>
+                    </a:stretch>
+                  </pic:blipFill>
+                  <pic:spPr>
+                    <a:xfrm>
+                      <a:off x="0" y="0"/>
+                      <a:ext cx="5400040" cy="3305175"/>
+                    </a:xfrm>
+                    <a:prstGeom prst="rect">
+                      <a:avLst/>
+                    </a:prstGeom>
+                  </pic:spPr>
+                </pic:pic>
+              </a:graphicData>
+            </a:graphic>
+          </wp:inline>
+        </w:drawing>
+      </w:r>
+      <w:r>
+        <w:rPr>
+          <w:rFonts w:eastAsia="Times New Roman" w:cstheme="minorHAnsi"/>
+          <w:sz w:val="24"/>
+          <w:szCs w:val="24"/>
+          <w:lang w:eastAsia="en-GB"/>
+        </w:rPr>
+        <w:br/>
+      </w:r>
+      <w:r>
+        <w:rPr>
+          <w:rFonts w:eastAsia="Times New Roman" w:cstheme="minorHAnsi"/>
+          <w:sz w:val="24"/>
+          <w:szCs w:val="24"/>
+          <w:lang w:eastAsia="en-GB"/>
+        </w:rPr>
+        <w:br/>
+      </w:r>
+      <w:r>
+        <w:rPr>
+          <w:sz w:val="24"/>
+        </w:rPr>
+        <w:t>After enabling the actuator and the circuit breaker, we can monitor various metrics through the actuator endpoint, including the circuit breaker status.</w:t>
+      </w:r>
+      <w:r>
+        <w:rPr>
+          <w:sz w:val="24"/>
+        </w:rPr>
+        <w:br/>
+        <w:t>Since we configured the circuit breaker to require a minimum of 5 failed requests before changing its status to OPEN, if we force 5 requests while the service is down and then access the actuator endpoint, we can verify that the status is now "OPEN".</w:t>
+      </w:r>
+      <w:r>
+        <w:rPr>
+          <w:sz w:val="24"/>
+        </w:rPr>
+        <w:br/>
+      </w:r>
+      <w:r>
+        <w:rPr>
+          <w:sz w:val="24"/>
+        </w:rPr>
+        <w:lastRenderedPageBreak/>
+        <w:br/>
+      </w:r>
+      <w:r>
+        <w:rPr>
+          <w:rFonts w:eastAsia="Times New Roman" w:cstheme="minorHAnsi"/>
+          <w:sz w:val="24"/>
+          <w:szCs w:val="24"/>
+          <w:lang w:eastAsia="en-GB"/>
+        </w:rPr>
+        <w:drawing>
+          <wp:inline distT="0" distB="0" distL="0" distR="0" wp14:anchorId="1C782626" wp14:editId="5096EDDE">
+            <wp:extent cx="5039428" cy="3162741"/>
+            <wp:effectExtent l="0" t="0" r="8890" b="0"/>
+            <wp:docPr id="29" name="Imagen 29"/>
+            <wp:cNvGraphicFramePr>
+              <a:graphicFrameLocks xmlns:a="http://schemas.openxmlformats.org/drawingml/2006/main" noChangeAspect="1"/>
+            </wp:cNvGraphicFramePr>
+            <a:graphic xmlns:a="http://schemas.openxmlformats.org/drawingml/2006/main">
+              <a:graphicData uri="http://schemas.openxmlformats.org/drawingml/2006/picture">
+                <pic:pic xmlns:pic="http://schemas.openxmlformats.org/drawingml/2006/picture">
+                  <pic:nvPicPr>
+                    <pic:cNvPr id="1" name=""/>
+                    <pic:cNvPicPr/>
+                  </pic:nvPicPr>
+                  <pic:blipFill>
+                    <a:blip r:embed="rId36"/>
+                    <a:stretch>
+                      <a:fillRect/>
+                    </a:stretch>
+                  </pic:blipFill>
+                  <pic:spPr>
+                    <a:xfrm>
+                      <a:off x="0" y="0"/>
                       <a:ext cx="5039428" cy="3162741"/>
                     </a:xfrm>
                     <a:prstGeom prst="rect">
@@ -5247,8 +5503,6 @@
           <w:lang w:eastAsia="en-GB"/>
         </w:rPr>
       </w:pPr>
-      <w:bookmarkStart w:id="0" w:name="_GoBack"/>
-      <w:bookmarkEnd w:id="0"/>
       <w:r>
         <w:rPr>
           <w:sz w:val="24"/>
@@ -5278,7 +5532,7 @@
                     <pic:cNvPicPr/>
                   </pic:nvPicPr>
                   <pic:blipFill>
-                    <a:blip r:embed="rId33"/>
+                    <a:blip r:embed="rId37"/>
                     <a:stretch>
                       <a:fillRect/>
                     </a:stretch>

</xml_diff>